<commit_message>
Add thesis diagrams and tables (8 figures embedded in thesis.docx)
Agent-Logs-Url: https://github.com/MHoseinN/uniProject/sessions/72c00095-4032-4722-b204-46b46e74deee

Co-authored-by: MHoseinN <188753223+MHoseinN@users.noreply.github.com>
</commit_message>
<xml_diff>
--- a/thesis.docx
+++ b/thesis.docx
@@ -2993,6 +2993,65 @@
     </w:p>
     <w:p>
       <w:pPr>
+        <w:spacing w:before="160" w:after="80"/>
+        <w:jc w:val="center"/>
+      </w:pPr>
+      <w:r>
+        <w:drawing>
+          <wp:inline xmlns:a="http://schemas.openxmlformats.org/drawingml/2006/main" xmlns:pic="http://schemas.openxmlformats.org/drawingml/2006/picture">
+            <wp:extent cx="5486400" cy="3671714"/>
+            <wp:docPr id="7" name="Picture 7"/>
+            <wp:cNvGraphicFramePr>
+              <a:graphicFrameLocks noChangeAspect="1"/>
+            </wp:cNvGraphicFramePr>
+            <a:graphic>
+              <a:graphicData uri="http://schemas.openxmlformats.org/drawingml/2006/picture">
+                <pic:pic>
+                  <pic:nvPicPr>
+                    <pic:cNvPr id="0" name="fig_architecture.png"/>
+                    <pic:cNvPicPr/>
+                  </pic:nvPicPr>
+                  <pic:blipFill>
+                    <a:blip r:embed="rId15"/>
+                    <a:stretch>
+                      <a:fillRect/>
+                    </a:stretch>
+                  </pic:blipFill>
+                  <pic:spPr>
+                    <a:xfrm>
+                      <a:off x="0" y="0"/>
+                      <a:ext cx="5486400" cy="3671714"/>
+                    </a:xfrm>
+                    <a:prstGeom prst="rect"/>
+                  </pic:spPr>
+                </pic:pic>
+              </a:graphicData>
+            </a:graphic>
+          </wp:inline>
+        </w:drawing>
+      </w:r>
+    </w:p>
+    <w:p>
+      <w:pPr>
+        <w:bidi/>
+        <w:spacing w:before="40" w:after="200"/>
+        <w:jc w:val="center"/>
+        <w:jc w:val="right"/>
+      </w:pPr>
+      <w:r>
+        <w:rPr>
+          <w:rFonts w:cs="B Nazanin"/>
+          <w:rFonts w:ascii="B Nazanin" w:hAnsi="B Nazanin"/>
+          <w:b w:val="0"/>
+          <w:i/>
+          <w:sz w:val="22"/>
+          <w:rtl/>
+        </w:rPr>
+        <w:t>شکل ۳-۱  معماری کلی سیستم RentShot</w:t>
+      </w:r>
+    </w:p>
+    <w:p>
+      <w:pPr>
         <w:bidi/>
         <w:spacing w:before="280" w:after="120"/>
         <w:jc w:val="right"/>
@@ -3155,6 +3214,65 @@
     </w:p>
     <w:p>
       <w:pPr>
+        <w:spacing w:before="160" w:after="80"/>
+        <w:jc w:val="center"/>
+      </w:pPr>
+      <w:r>
+        <w:drawing>
+          <wp:inline xmlns:a="http://schemas.openxmlformats.org/drawingml/2006/main" xmlns:pic="http://schemas.openxmlformats.org/drawingml/2006/picture">
+            <wp:extent cx="5486400" cy="4805564"/>
+            <wp:docPr id="6" name="Picture 6"/>
+            <wp:cNvGraphicFramePr>
+              <a:graphicFrameLocks noChangeAspect="1"/>
+            </wp:cNvGraphicFramePr>
+            <a:graphic>
+              <a:graphicData uri="http://schemas.openxmlformats.org/drawingml/2006/picture">
+                <pic:pic>
+                  <pic:nvPicPr>
+                    <pic:cNvPr id="0" name="fig_usecase.png"/>
+                    <pic:cNvPicPr/>
+                  </pic:nvPicPr>
+                  <pic:blipFill>
+                    <a:blip r:embed="rId14"/>
+                    <a:stretch>
+                      <a:fillRect/>
+                    </a:stretch>
+                  </pic:blipFill>
+                  <pic:spPr>
+                    <a:xfrm>
+                      <a:off x="0" y="0"/>
+                      <a:ext cx="5486400" cy="4805564"/>
+                    </a:xfrm>
+                    <a:prstGeom prst="rect"/>
+                  </pic:spPr>
+                </pic:pic>
+              </a:graphicData>
+            </a:graphic>
+          </wp:inline>
+        </w:drawing>
+      </w:r>
+    </w:p>
+    <w:p>
+      <w:pPr>
+        <w:bidi/>
+        <w:spacing w:before="40" w:after="200"/>
+        <w:jc w:val="center"/>
+        <w:jc w:val="right"/>
+      </w:pPr>
+      <w:r>
+        <w:rPr>
+          <w:rFonts w:cs="B Nazanin"/>
+          <w:rFonts w:ascii="B Nazanin" w:hAnsi="B Nazanin"/>
+          <w:b w:val="0"/>
+          <w:i/>
+          <w:sz w:val="22"/>
+          <w:rtl/>
+        </w:rPr>
+        <w:t>شکل ۳-۲  نمودار موردکاربرد سیستم RentShot</w:t>
+      </w:r>
+    </w:p>
+    <w:p>
+      <w:pPr>
         <w:bidi/>
         <w:spacing w:before="280" w:after="120"/>
         <w:jc w:val="right"/>
@@ -3547,6 +3665,65 @@
           <w:rtl/>
         </w:rPr>
         <w:t>پایگاه داده سیستم RentShot در MongoDB پیاده‌سازی شده است. در MongoDB به‌جای جداول، از مجموعه‌ها (Collections) و به‌جای ردیف‌ها، از اسناد (Documents) استفاده می‌شود. طراحی پایگاه داده شامل چهار مجموعه اصلی است:</w:t>
+      </w:r>
+    </w:p>
+    <w:p>
+      <w:pPr>
+        <w:spacing w:before="160" w:after="80"/>
+        <w:jc w:val="center"/>
+      </w:pPr>
+      <w:r>
+        <w:drawing>
+          <wp:inline xmlns:a="http://schemas.openxmlformats.org/drawingml/2006/main" xmlns:pic="http://schemas.openxmlformats.org/drawingml/2006/picture">
+            <wp:extent cx="5486400" cy="3460623"/>
+            <wp:docPr id="5" name="Picture 5"/>
+            <wp:cNvGraphicFramePr>
+              <a:graphicFrameLocks noChangeAspect="1"/>
+            </wp:cNvGraphicFramePr>
+            <a:graphic>
+              <a:graphicData uri="http://schemas.openxmlformats.org/drawingml/2006/picture">
+                <pic:pic>
+                  <pic:nvPicPr>
+                    <pic:cNvPr id="0" name="fig_er_diagram.png"/>
+                    <pic:cNvPicPr/>
+                  </pic:nvPicPr>
+                  <pic:blipFill>
+                    <a:blip r:embed="rId13"/>
+                    <a:stretch>
+                      <a:fillRect/>
+                    </a:stretch>
+                  </pic:blipFill>
+                  <pic:spPr>
+                    <a:xfrm>
+                      <a:off x="0" y="0"/>
+                      <a:ext cx="5486400" cy="3460623"/>
+                    </a:xfrm>
+                    <a:prstGeom prst="rect"/>
+                  </pic:spPr>
+                </pic:pic>
+              </a:graphicData>
+            </a:graphic>
+          </wp:inline>
+        </w:drawing>
+      </w:r>
+    </w:p>
+    <w:p>
+      <w:pPr>
+        <w:bidi/>
+        <w:spacing w:before="40" w:after="200"/>
+        <w:jc w:val="center"/>
+        <w:jc w:val="right"/>
+      </w:pPr>
+      <w:r>
+        <w:rPr>
+          <w:rFonts w:cs="B Nazanin"/>
+          <w:rFonts w:ascii="B Nazanin" w:hAnsi="B Nazanin"/>
+          <w:b w:val="0"/>
+          <w:i/>
+          <w:sz w:val="22"/>
+          <w:rtl/>
+        </w:rPr>
+        <w:t>شکل ۳-۳  نمودار مدل داده‌ای (ER Diagram) سیستم RentShot</w:t>
       </w:r>
     </w:p>
     <w:p>
@@ -5140,6 +5317,65 @@
     </w:p>
     <w:p>
       <w:pPr>
+        <w:spacing w:before="160" w:after="80"/>
+        <w:jc w:val="center"/>
+      </w:pPr>
+      <w:r>
+        <w:drawing>
+          <wp:inline xmlns:a="http://schemas.openxmlformats.org/drawingml/2006/main" xmlns:pic="http://schemas.openxmlformats.org/drawingml/2006/picture">
+            <wp:extent cx="5303520" cy="2286108"/>
+            <wp:docPr id="8" name="Picture 8"/>
+            <wp:cNvGraphicFramePr>
+              <a:graphicFrameLocks noChangeAspect="1"/>
+            </wp:cNvGraphicFramePr>
+            <a:graphic>
+              <a:graphicData uri="http://schemas.openxmlformats.org/drawingml/2006/picture">
+                <pic:pic>
+                  <pic:nvPicPr>
+                    <pic:cNvPr id="0" name="table_fonts.png"/>
+                    <pic:cNvPicPr/>
+                  </pic:nvPicPr>
+                  <pic:blipFill>
+                    <a:blip r:embed="rId16"/>
+                    <a:stretch>
+                      <a:fillRect/>
+                    </a:stretch>
+                  </pic:blipFill>
+                  <pic:spPr>
+                    <a:xfrm>
+                      <a:off x="0" y="0"/>
+                      <a:ext cx="5303520" cy="2286108"/>
+                    </a:xfrm>
+                    <a:prstGeom prst="rect"/>
+                  </pic:spPr>
+                </pic:pic>
+              </a:graphicData>
+            </a:graphic>
+          </wp:inline>
+        </w:drawing>
+      </w:r>
+    </w:p>
+    <w:p>
+      <w:pPr>
+        <w:bidi/>
+        <w:spacing w:before="40" w:after="200"/>
+        <w:jc w:val="center"/>
+        <w:jc w:val="right"/>
+      </w:pPr>
+      <w:r>
+        <w:rPr>
+          <w:rFonts w:cs="B Nazanin"/>
+          <w:rFonts w:ascii="B Nazanin" w:hAnsi="B Nazanin"/>
+          <w:b w:val="0"/>
+          <w:i/>
+          <w:sz w:val="22"/>
+          <w:rtl/>
+        </w:rPr>
+        <w:t>جدول ۴-۱  قلم‌ها و سبک‌های استفاده‌شده در پایان‌نامه</w:t>
+      </w:r>
+    </w:p>
+    <w:p>
+      <w:pPr>
         <w:bidi/>
         <w:spacing w:before="280" w:after="120"/>
         <w:jc w:val="right"/>
@@ -6040,6 +6276,65 @@
     </w:p>
     <w:p>
       <w:pPr>
+        <w:spacing w:before="160" w:after="80"/>
+        <w:jc w:val="center"/>
+      </w:pPr>
+      <w:r>
+        <w:drawing>
+          <wp:inline xmlns:a="http://schemas.openxmlformats.org/drawingml/2006/main" xmlns:pic="http://schemas.openxmlformats.org/drawingml/2006/picture">
+            <wp:extent cx="4114800" cy="4454398"/>
+            <wp:docPr id="3" name="Picture 3"/>
+            <wp:cNvGraphicFramePr>
+              <a:graphicFrameLocks noChangeAspect="1"/>
+            </wp:cNvGraphicFramePr>
+            <a:graphic>
+              <a:graphicData uri="http://schemas.openxmlformats.org/drawingml/2006/picture">
+                <pic:pic>
+                  <pic:nvPicPr>
+                    <pic:cNvPr id="0" name="fig_reservation_flow.png"/>
+                    <pic:cNvPicPr/>
+                  </pic:nvPicPr>
+                  <pic:blipFill>
+                    <a:blip r:embed="rId11"/>
+                    <a:stretch>
+                      <a:fillRect/>
+                    </a:stretch>
+                  </pic:blipFill>
+                  <pic:spPr>
+                    <a:xfrm>
+                      <a:off x="0" y="0"/>
+                      <a:ext cx="4114800" cy="4454398"/>
+                    </a:xfrm>
+                    <a:prstGeom prst="rect"/>
+                  </pic:spPr>
+                </pic:pic>
+              </a:graphicData>
+            </a:graphic>
+          </wp:inline>
+        </w:drawing>
+      </w:r>
+    </w:p>
+    <w:p>
+      <w:pPr>
+        <w:bidi/>
+        <w:spacing w:before="40" w:after="200"/>
+        <w:jc w:val="center"/>
+        <w:jc w:val="right"/>
+      </w:pPr>
+      <w:r>
+        <w:rPr>
+          <w:rFonts w:cs="B Nazanin"/>
+          <w:rFonts w:ascii="B Nazanin" w:hAnsi="B Nazanin"/>
+          <w:b w:val="0"/>
+          <w:i/>
+          <w:sz w:val="22"/>
+          <w:rtl/>
+        </w:rPr>
+        <w:t>شکل ۴-۲  نمودار جریان ثبت رزرو در سیستم</w:t>
+      </w:r>
+    </w:p>
+    <w:p>
+      <w:pPr>
         <w:bidi/>
         <w:spacing w:before="280" w:after="120"/>
         <w:jc w:val="right"/>
@@ -6810,6 +7105,65 @@
           <w:rtl/>
         </w:rPr>
         <w:t>احراز هویت با JWT پیاده‌سازی شده است. پس از ورود موفق، یک توکن JWT ایجاد و به کلاینت ارسال می‌شود. این توکن شامل payload حاوی id کاربر و نقش (role) است. در هر درخواست محافظت‌شده، میان‌افزار auth.js توکن را از هدر Authorization استخراج و اعتبارسنجی می‌کند.</w:t>
+      </w:r>
+    </w:p>
+    <w:p>
+      <w:pPr>
+        <w:spacing w:before="160" w:after="80"/>
+        <w:jc w:val="center"/>
+      </w:pPr>
+      <w:r>
+        <w:drawing>
+          <wp:inline xmlns:a="http://schemas.openxmlformats.org/drawingml/2006/main" xmlns:pic="http://schemas.openxmlformats.org/drawingml/2006/picture">
+            <wp:extent cx="5029200" cy="3960421"/>
+            <wp:docPr id="4" name="Picture 4"/>
+            <wp:cNvGraphicFramePr>
+              <a:graphicFrameLocks noChangeAspect="1"/>
+            </wp:cNvGraphicFramePr>
+            <a:graphic>
+              <a:graphicData uri="http://schemas.openxmlformats.org/drawingml/2006/picture">
+                <pic:pic>
+                  <pic:nvPicPr>
+                    <pic:cNvPr id="0" name="fig_auth_flow.png"/>
+                    <pic:cNvPicPr/>
+                  </pic:nvPicPr>
+                  <pic:blipFill>
+                    <a:blip r:embed="rId12"/>
+                    <a:stretch>
+                      <a:fillRect/>
+                    </a:stretch>
+                  </pic:blipFill>
+                  <pic:spPr>
+                    <a:xfrm>
+                      <a:off x="0" y="0"/>
+                      <a:ext cx="5029200" cy="3960421"/>
+                    </a:xfrm>
+                    <a:prstGeom prst="rect"/>
+                  </pic:spPr>
+                </pic:pic>
+              </a:graphicData>
+            </a:graphic>
+          </wp:inline>
+        </w:drawing>
+      </w:r>
+    </w:p>
+    <w:p>
+      <w:pPr>
+        <w:bidi/>
+        <w:spacing w:before="40" w:after="200"/>
+        <w:jc w:val="center"/>
+        <w:jc w:val="right"/>
+      </w:pPr>
+      <w:r>
+        <w:rPr>
+          <w:rFonts w:cs="B Nazanin"/>
+          <w:rFonts w:ascii="B Nazanin" w:hAnsi="B Nazanin"/>
+          <w:b w:val="0"/>
+          <w:i/>
+          <w:sz w:val="22"/>
+          <w:rtl/>
+        </w:rPr>
+        <w:t>شکل ۴-۱  نمودار جریان احراز هویت کاربر</w:t>
       </w:r>
     </w:p>
     <w:p>
@@ -7031,6 +7385,65 @@
           <w:rtl/>
         </w:rPr>
         <w:t>آزمون عملکردی با هدف تأیید صحت عملکرد تمام قابلیت‌های سیستم انجام شده است. جدول زیر خلاصه‌ای از آزمون‌های انجام‌شده و نتایج آنها را نشان می‌دهد:</w:t>
+      </w:r>
+    </w:p>
+    <w:p>
+      <w:pPr>
+        <w:spacing w:before="160" w:after="80"/>
+        <w:jc w:val="center"/>
+      </w:pPr>
+      <w:r>
+        <w:drawing>
+          <wp:inline xmlns:a="http://schemas.openxmlformats.org/drawingml/2006/main" xmlns:pic="http://schemas.openxmlformats.org/drawingml/2006/picture">
+            <wp:extent cx="5943600" cy="2984716"/>
+            <wp:docPr id="2" name="Picture 2"/>
+            <wp:cNvGraphicFramePr>
+              <a:graphicFrameLocks noChangeAspect="1"/>
+            </wp:cNvGraphicFramePr>
+            <a:graphic>
+              <a:graphicData uri="http://schemas.openxmlformats.org/drawingml/2006/picture">
+                <pic:pic>
+                  <pic:nvPicPr>
+                    <pic:cNvPr id="0" name="table_test_results.png"/>
+                    <pic:cNvPicPr/>
+                  </pic:nvPicPr>
+                  <pic:blipFill>
+                    <a:blip r:embed="rId10"/>
+                    <a:stretch>
+                      <a:fillRect/>
+                    </a:stretch>
+                  </pic:blipFill>
+                  <pic:spPr>
+                    <a:xfrm>
+                      <a:off x="0" y="0"/>
+                      <a:ext cx="5943600" cy="2984716"/>
+                    </a:xfrm>
+                    <a:prstGeom prst="rect"/>
+                  </pic:spPr>
+                </pic:pic>
+              </a:graphicData>
+            </a:graphic>
+          </wp:inline>
+        </w:drawing>
+      </w:r>
+    </w:p>
+    <w:p>
+      <w:pPr>
+        <w:bidi/>
+        <w:spacing w:before="40" w:after="200"/>
+        <w:jc w:val="center"/>
+        <w:jc w:val="right"/>
+      </w:pPr>
+      <w:r>
+        <w:rPr>
+          <w:rFonts w:cs="B Nazanin"/>
+          <w:rFonts w:ascii="B Nazanin" w:hAnsi="B Nazanin"/>
+          <w:b w:val="0"/>
+          <w:i/>
+          <w:sz w:val="22"/>
+          <w:rtl/>
+        </w:rPr>
+        <w:t>جدول ۵-۱  نتایج آزمون‌های عملکردی سیستم</w:t>
       </w:r>
     </w:p>
     <w:tbl>
@@ -9140,6 +9553,65 @@
           <w:rtl/>
         </w:rPr>
         <w:t>جدول زیر تمام endpoint های API سیستم RentShot را به همراه متد HTTP، نیاز به احراز هویت و توضیح مختصر نشان می‌دهد:</w:t>
+      </w:r>
+    </w:p>
+    <w:p>
+      <w:pPr>
+        <w:spacing w:before="160" w:after="80"/>
+        <w:jc w:val="center"/>
+      </w:pPr>
+      <w:r>
+        <w:drawing>
+          <wp:inline xmlns:a="http://schemas.openxmlformats.org/drawingml/2006/main" xmlns:pic="http://schemas.openxmlformats.org/drawingml/2006/picture">
+            <wp:extent cx="5486400" cy="3298721"/>
+            <wp:docPr id="1" name="Picture 1"/>
+            <wp:cNvGraphicFramePr>
+              <a:graphicFrameLocks noChangeAspect="1"/>
+            </wp:cNvGraphicFramePr>
+            <a:graphic>
+              <a:graphicData uri="http://schemas.openxmlformats.org/drawingml/2006/picture">
+                <pic:pic>
+                  <pic:nvPicPr>
+                    <pic:cNvPr id="0" name="table_api.png"/>
+                    <pic:cNvPicPr/>
+                  </pic:nvPicPr>
+                  <pic:blipFill>
+                    <a:blip r:embed="rId9"/>
+                    <a:stretch>
+                      <a:fillRect/>
+                    </a:stretch>
+                  </pic:blipFill>
+                  <pic:spPr>
+                    <a:xfrm>
+                      <a:off x="0" y="0"/>
+                      <a:ext cx="5486400" cy="3298721"/>
+                    </a:xfrm>
+                    <a:prstGeom prst="rect"/>
+                  </pic:spPr>
+                </pic:pic>
+              </a:graphicData>
+            </a:graphic>
+          </wp:inline>
+        </w:drawing>
+      </w:r>
+    </w:p>
+    <w:p>
+      <w:pPr>
+        <w:bidi/>
+        <w:spacing w:before="40" w:after="200"/>
+        <w:jc w:val="center"/>
+        <w:jc w:val="right"/>
+      </w:pPr>
+      <w:r>
+        <w:rPr>
+          <w:rFonts w:cs="B Nazanin"/>
+          <w:rFonts w:ascii="B Nazanin" w:hAnsi="B Nazanin"/>
+          <w:b w:val="0"/>
+          <w:i/>
+          <w:sz w:val="22"/>
+          <w:rtl/>
+        </w:rPr>
+        <w:t>جدول پ-۱  جدول کامل Endpoint های API سیستم RentShot</w:t>
       </w:r>
     </w:p>
     <w:tbl>

</xml_diff>